<commit_message>
snapshot before changing whole script to use the tc models only
</commit_message>
<xml_diff>
--- a/scripts/glm_analysis_test.docx
+++ b/scripts/glm_analysis_test.docx
@@ -46,7 +46,7 @@
       <w:r>
         <w:drawing>
           <wp:inline>
-            <wp:extent cx="5334000" cy="4267200"/>
+            <wp:extent cx="4587290" cy="3669832"/>
             <wp:effectExtent b="0" l="0" r="0" t="0"/>
             <wp:docPr descr="" title="" id="21" name="Picture"/>
             <a:graphic>
@@ -67,7 +67,7 @@
                   <pic:spPr bwMode="auto">
                     <a:xfrm>
                       <a:off x="0" y="0"/>
-                      <a:ext cx="5334000" cy="4267200"/>
+                      <a:ext cx="4587290" cy="3669832"/>
                     </a:xfrm>
                     <a:prstGeom prst="rect">
                       <a:avLst/>
@@ -181,7 +181,10 @@
         <w:t xml:space="preserve"> </w:t>
       </w:r>
       <w:r>
-        <w:t xml:space="preserve">of a correct choice at the end of the test was higher (</w:t>
+        <w:t xml:space="preserve">of a correct choice at the end of the test was</w:t>
+      </w:r>
+      <w:r>
+        <w:t xml:space="preserve"> </w:t>
       </w:r>
       <m:oMath>
         <m:sSub>
@@ -222,7 +225,10 @@
         <w:t xml:space="preserve"> </w:t>
       </w:r>
       <w:r>
-        <w:t xml:space="preserve">= 0.905, 95% CI [0.817, 0.954]) than at the start of the control (</w:t>
+        <w:t xml:space="preserve">= 0.905 (95% CI [0.817, 0.954]). The lower bound of the 95% confidence interval ([insert lower bound here]) was &gt;50%, implying that</w:t>
+      </w:r>
+      <w:r>
+        <w:t xml:space="preserve"> </w:t>
       </w:r>
       <m:oMath>
         <m:sSub>
@@ -263,15 +269,7 @@
         <w:t xml:space="preserve"> </w:t>
       </w:r>
       <w:r>
-        <w:t xml:space="preserve">= 0.572, 95% CI: [0.358, 0.763]), and this difference was significant (log odds ratio = 1.968, p &lt;0.001) (Figure 1, compare error bars between test and control panel).</w:t>
-      </w:r>
-    </w:p>
-    <w:p>
-      <w:pPr>
-        <w:pStyle w:val="BodyText"/>
-      </w:pPr>
-      <w:r>
-        <w:t xml:space="preserve">Also note that</w:t>
+        <w:t xml:space="preserve">was significantly higher chance (50%) (black error bar in Figure 1 test panel does not overlap horizontal dashed line).</w:t>
       </w:r>
       <w:r>
         <w:t xml:space="preserve"> </w:t>
@@ -315,10 +313,7 @@
         <w:t xml:space="preserve"> </w:t>
       </w:r>
       <w:r>
-        <w:t xml:space="preserve">is significantly above chance (95% confidence ribbon does not overlap the 50% line) from an early trial number and remains that way until the end of the test. In contrast, the</w:t>
-      </w:r>
-      <w:r>
-        <w:t xml:space="preserve"> </w:t>
+        <w:t xml:space="preserve">at the end of the experiment was also significantly higher than at the start of the control (</w:t>
       </w:r>
       <m:oMath>
         <m:sSub>
@@ -359,7 +354,103 @@
         <w:t xml:space="preserve"> </w:t>
       </w:r>
       <w:r>
-        <w:t xml:space="preserve">in the control phase is never significantly above chance for the duration of the control (95% confidence ribbon overlaps the 50% line).</w:t>
+        <w:t xml:space="preserve">= 0.572, 95% CI [0.358, 0.763]), and this difference was significant (log odds ratio = 1.968, p &lt;0.001) (Figure 1, note lack of overlap of error bars between test and control panel).</w:t>
+      </w:r>
+    </w:p>
+    <w:p>
+      <w:pPr>
+        <w:pStyle w:val="BodyText"/>
+      </w:pPr>
+      <w:r>
+        <w:t xml:space="preserve">Also note that</w:t>
+      </w:r>
+      <w:r>
+        <w:t xml:space="preserve"> </w:t>
+      </w:r>
+      <m:oMath>
+        <m:sSub>
+          <m:e>
+            <m:r>
+              <m:t>P</m:t>
+            </m:r>
+          </m:e>
+          <m:sub>
+            <m:r>
+              <m:rPr>
+                <m:sty m:val="p"/>
+              </m:rPr>
+              <m:t>c</m:t>
+            </m:r>
+            <m:r>
+              <m:rPr>
+                <m:sty m:val="p"/>
+              </m:rPr>
+              <m:t>o</m:t>
+            </m:r>
+            <m:r>
+              <m:rPr>
+                <m:sty m:val="p"/>
+              </m:rPr>
+              <m:t>r</m:t>
+            </m:r>
+            <m:r>
+              <m:rPr>
+                <m:sty m:val="p"/>
+              </m:rPr>
+              <m:t>r</m:t>
+            </m:r>
+          </m:sub>
+        </m:sSub>
+      </m:oMath>
+      <w:r>
+        <w:t xml:space="preserve"> </w:t>
+      </w:r>
+      <w:r>
+        <w:t xml:space="preserve">is significantly above chance (grey shaded 95% confidence ribbon in Figure 1 does not overlap the 50% line) from an early trial number and remains that way until the end of the test. In contrast, the</w:t>
+      </w:r>
+      <w:r>
+        <w:t xml:space="preserve"> </w:t>
+      </w:r>
+      <m:oMath>
+        <m:sSub>
+          <m:e>
+            <m:r>
+              <m:t>P</m:t>
+            </m:r>
+          </m:e>
+          <m:sub>
+            <m:r>
+              <m:rPr>
+                <m:sty m:val="p"/>
+              </m:rPr>
+              <m:t>c</m:t>
+            </m:r>
+            <m:r>
+              <m:rPr>
+                <m:sty m:val="p"/>
+              </m:rPr>
+              <m:t>o</m:t>
+            </m:r>
+            <m:r>
+              <m:rPr>
+                <m:sty m:val="p"/>
+              </m:rPr>
+              <m:t>r</m:t>
+            </m:r>
+            <m:r>
+              <m:rPr>
+                <m:sty m:val="p"/>
+              </m:rPr>
+              <m:t>r</m:t>
+            </m:r>
+          </m:sub>
+        </m:sSub>
+      </m:oMath>
+      <w:r>
+        <w:t xml:space="preserve"> </w:t>
+      </w:r>
+      <w:r>
+        <w:t xml:space="preserve">in the control phase is never significantly above chance for the duration of the control (95% confidence ribbon overlaps the 50% line), as one would expect for wasps making choices in the absence of any information regarding the location of the reward.</w:t>
       </w:r>
     </w:p>
     <w:p>
@@ -382,48 +473,12 @@
     </w:p>
     <w:p>
       <w:pPr>
-        <w:pStyle w:val="Compact"/>
-        <w:numPr>
-          <w:ilvl w:val="0"/>
-          <w:numId w:val="1001"/>
-        </w:numPr>
-      </w:pPr>
-      <w:r>
-        <w:t xml:space="preserve">Do they need optic flow?</w:t>
-      </w:r>
-    </w:p>
-    <w:p>
-      <w:pPr>
-        <w:pStyle w:val="Compact"/>
-        <w:numPr>
-          <w:ilvl w:val="0"/>
-          <w:numId w:val="1001"/>
-        </w:numPr>
-      </w:pPr>
-      <w:r>
-        <w:t xml:space="preserve">Can they distinguish simple brightness differences?</w:t>
-      </w:r>
-    </w:p>
-    <w:p>
-      <w:pPr>
-        <w:pStyle w:val="Compact"/>
-        <w:numPr>
-          <w:ilvl w:val="0"/>
-          <w:numId w:val="1001"/>
-        </w:numPr>
-      </w:pPr>
-      <w:r>
-        <w:t xml:space="preserve">are there differences in performance among artificial stimuli?</w:t>
-      </w:r>
-    </w:p>
-    <w:p>
-      <w:pPr>
         <w:pStyle w:val="FirstParagraph"/>
       </w:pPr>
       <w:r>
         <w:drawing>
           <wp:inline>
-            <wp:extent cx="5334000" cy="4267200"/>
+            <wp:extent cx="4587290" cy="3669832"/>
             <wp:effectExtent b="0" l="0" r="0" t="0"/>
             <wp:docPr descr="" title="" id="25" name="Picture"/>
             <a:graphic>
@@ -444,7 +499,7 @@
                   <pic:spPr bwMode="auto">
                     <a:xfrm>
                       <a:off x="0" y="0"/>
-                      <a:ext cx="5334000" cy="4267200"/>
+                      <a:ext cx="4587290" cy="3669832"/>
                     </a:xfrm>
                     <a:prstGeom prst="rect">
                       <a:avLst/>
@@ -739,7 +794,7 @@
         <w:pStyle w:val="BodyText"/>
       </w:pPr>
       <w:r>
-        <w:t xml:space="preserve">To answer whether wasps require optic flow information to discriminate patterns we tested whether they could distinguish between oblique stripes oriented at 45 degrees to the right or left of the y-maze arm’s long axis and the general direction of wasp travel.</w:t>
+        <w:t xml:space="preserve">To answer whether wasps require optic flow information to discriminate patterns we tested whether they could distinguish a new artificial pattern-pair, one consisting of oblique stripes oriented at either 45 degrees to the right or to the left of the y-maze arm’s long axis and the general direction of wasp travel. Here again, we tested whether the proportion of correct choices for this pattern-pair was &gt;50% as evidence that wasps do not rely exclusively on optic flow to discriminate among stimuli. We did not run contr… (to do, incl. control data and use facet grid figure with only the bright diff and oblique data)</w:t>
       </w:r>
     </w:p>
     <w:p>
@@ -829,7 +884,7 @@
         <w:t xml:space="preserve"> </w:t>
       </w:r>
       <w:r>
-        <w:t xml:space="preserve">= 0.521, 95% CI: [0.409, 0.631]) but rose steeply, reaching 0.880 (95% CI: [0.796, 0.932]) by the end of the experiment (trial 66), which is significantly higher than expected by chance (50%).</w:t>
+        <w:t xml:space="preserve">= 0.521, 95% CI [0.409, 0.631]) but rose steeply, reaching 0.880 (95% CI [0.796, 0.932]) by the end of the experiment (trial 66), which is significantly higher than expected by chance (50%).</w:t>
       </w:r>
     </w:p>
     <w:p>
@@ -966,7 +1021,7 @@
         <w:t xml:space="preserve"> </w:t>
       </w:r>
       <w:r>
-        <w:t xml:space="preserve">= 0.610, 95% CI: [0.436, 0.759])) but rises with experience and by the end of the experiment (trial 26)</w:t>
+        <w:t xml:space="preserve">= 0.610, 95% CI [0.436, 0.759]) but rises with experience and by the end of the experiment (trial 26)</w:t>
       </w:r>
       <w:r>
         <w:t xml:space="preserve"> </w:t>
@@ -1010,7 +1065,7 @@
         <w:t xml:space="preserve"> </w:t>
       </w:r>
       <w:r>
-        <w:t xml:space="preserve">reached 0.780 (95% CI: [0.500, 0.927]). Performance at the end of the experiment is only borderline significantly higher than 50% because of the increased uncertainty in the slope / effect of trials on performance due to the lower number of trials run in this experiment. However, if one uses other metrics or analyses to compare performance to the 50% line, they are significantly different (for example, comparing performance at an intermediate trial or comparing the average performance of the last five trials to the 50% line).</w:t>
+        <w:t xml:space="preserve">reached 0.780 (95% CI [0.500, 0.927]). Performance at the end of the experiment is only borderline significantly higher than 50% because of the increased uncertainty in the slope / effect of trials on performance due to the lower number of trials run in this experiment. However, if one uses other metrics or analyses to compare performance to the 50% line, they are significantly different (for example, comparing performance at an intermediate trial or comparing the average performance of the last five trials to the 50% line).</w:t>
       </w:r>
     </w:p>
     <w:p>
@@ -1027,6 +1082,32 @@
       </w:pPr>
       <w:r>
         <w:t xml:space="preserve">Comparison among different artificial stimuli:</w:t>
+      </w:r>
+    </w:p>
+    <w:p>
+      <w:pPr>
+        <w:pStyle w:val="BodyText"/>
+      </w:pPr>
+      <w:r>
+        <w:t xml:space="preserve">to do:</w:t>
+      </w:r>
+      <w:r>
+        <w:t xml:space="preserve"> </w:t>
+      </w:r>
+      <w:r>
+        <w:t xml:space="preserve">- comparison of prop correct at the same trial number?</w:t>
+      </w:r>
+      <w:r>
+        <w:t xml:space="preserve"> </w:t>
+      </w:r>
+      <w:r>
+        <w:t xml:space="preserve">- comparison of slopes?</w:t>
+      </w:r>
+      <w:r>
+        <w:t xml:space="preserve"> </w:t>
+      </w:r>
+      <w:r>
+        <w:t xml:space="preserve">- What would be the appropriate way to compare among these experiments?</w:t>
       </w:r>
     </w:p>
     <w:p>
@@ -1052,7 +1133,7 @@
         <w:pStyle w:val="Compact"/>
         <w:numPr>
           <w:ilvl w:val="0"/>
-          <w:numId w:val="1002"/>
+          <w:numId w:val="1001"/>
         </w:numPr>
       </w:pPr>
       <w:r>
@@ -1064,7 +1145,7 @@
         <w:pStyle w:val="Compact"/>
         <w:numPr>
           <w:ilvl w:val="0"/>
-          <w:numId w:val="1002"/>
+          <w:numId w:val="1001"/>
         </w:numPr>
       </w:pPr>
       <w:r>
@@ -1076,7 +1157,7 @@
         <w:pStyle w:val="Compact"/>
         <w:numPr>
           <w:ilvl w:val="0"/>
-          <w:numId w:val="1002"/>
+          <w:numId w:val="1001"/>
         </w:numPr>
       </w:pPr>
       <w:r>
@@ -1090,7 +1171,7 @@
       <w:r>
         <w:drawing>
           <wp:inline>
-            <wp:extent cx="5334000" cy="4267200"/>
+            <wp:extent cx="4587290" cy="3669832"/>
             <wp:effectExtent b="0" l="0" r="0" t="0"/>
             <wp:docPr descr="" title="" id="29" name="Picture"/>
             <a:graphic>
@@ -1111,7 +1192,7 @@
                   <pic:spPr bwMode="auto">
                     <a:xfrm>
                       <a:off x="0" y="0"/>
-                      <a:ext cx="5334000" cy="4267200"/>
+                      <a:ext cx="4587290" cy="3669832"/>
                     </a:xfrm>
                     <a:prstGeom prst="rect">
                       <a:avLst/>
@@ -1712,7 +1793,7 @@
       <w:r>
         <w:drawing>
           <wp:inline>
-            <wp:extent cx="5334000" cy="4267200"/>
+            <wp:extent cx="4587290" cy="3669832"/>
             <wp:effectExtent b="0" l="0" r="0" t="0"/>
             <wp:docPr descr="" title="" id="32" name="Picture"/>
             <a:graphic>
@@ -1733,7 +1814,7 @@
                   <pic:spPr bwMode="auto">
                     <a:xfrm>
                       <a:off x="0" y="0"/>
-                      <a:ext cx="5334000" cy="4267200"/>
+                      <a:ext cx="4587290" cy="3669832"/>
                     </a:xfrm>
                     <a:prstGeom prst="rect">
                       <a:avLst/>
@@ -2623,7 +2704,7 @@
       <w:r>
         <w:drawing>
           <wp:inline>
-            <wp:extent cx="5334000" cy="4267200"/>
+            <wp:extent cx="4587290" cy="3669832"/>
             <wp:effectExtent b="0" l="0" r="0" t="0"/>
             <wp:docPr descr="End-of-test predicted performance by canopy type. Each point is one experiment; vertical bars are 95% CIs." title="" id="35" name="Picture"/>
             <a:graphic>
@@ -2644,7 +2725,7 @@
                   <pic:spPr bwMode="auto">
                     <a:xfrm>
                       <a:off x="0" y="0"/>
-                      <a:ext cx="5334000" cy="4267200"/>
+                      <a:ext cx="4587290" cy="3669832"/>
                     </a:xfrm>
                     <a:prstGeom prst="rect">
                       <a:avLst/>
@@ -2924,7 +3005,7 @@
         <w:pStyle w:val="Compact"/>
         <w:numPr>
           <w:ilvl w:val="0"/>
-          <w:numId w:val="1003"/>
+          <w:numId w:val="1002"/>
         </w:numPr>
       </w:pPr>
       <w:r>
@@ -2936,7 +3017,7 @@
         <w:pStyle w:val="Compact"/>
         <w:numPr>
           <w:ilvl w:val="0"/>
-          <w:numId w:val="1003"/>
+          <w:numId w:val="1002"/>
         </w:numPr>
       </w:pPr>
       <w:r>
@@ -2948,7 +3029,7 @@
         <w:pStyle w:val="Compact"/>
         <w:numPr>
           <w:ilvl w:val="0"/>
-          <w:numId w:val="1003"/>
+          <w:numId w:val="1002"/>
         </w:numPr>
       </w:pPr>
       <w:r>
@@ -2960,7 +3041,7 @@
         <w:pStyle w:val="Compact"/>
         <w:numPr>
           <w:ilvl w:val="0"/>
-          <w:numId w:val="1003"/>
+          <w:numId w:val="1002"/>
         </w:numPr>
       </w:pPr>
       <w:r>
@@ -2972,7 +3053,7 @@
         <w:pStyle w:val="Compact"/>
         <w:numPr>
           <w:ilvl w:val="0"/>
-          <w:numId w:val="1003"/>
+          <w:numId w:val="1002"/>
         </w:numPr>
       </w:pPr>
       <w:r>
@@ -2984,7 +3065,7 @@
         <w:pStyle w:val="Compact"/>
         <w:numPr>
           <w:ilvl w:val="0"/>
-          <w:numId w:val="1003"/>
+          <w:numId w:val="1002"/>
         </w:numPr>
       </w:pPr>
       <w:r>
@@ -2996,7 +3077,7 @@
         <w:pStyle w:val="Compact"/>
         <w:numPr>
           <w:ilvl w:val="0"/>
-          <w:numId w:val="1003"/>
+          <w:numId w:val="1002"/>
         </w:numPr>
       </w:pPr>
       <w:r>
@@ -3008,7 +3089,7 @@
         <w:pStyle w:val="Compact"/>
         <w:numPr>
           <w:ilvl w:val="1"/>
-          <w:numId w:val="1004"/>
+          <w:numId w:val="1003"/>
         </w:numPr>
       </w:pPr>
       <w:r>
@@ -3020,7 +3101,7 @@
         <w:pStyle w:val="Compact"/>
         <w:numPr>
           <w:ilvl w:val="0"/>
-          <w:numId w:val="1003"/>
+          <w:numId w:val="1002"/>
         </w:numPr>
       </w:pPr>
       <w:r>
@@ -3032,7 +3113,7 @@
         <w:pStyle w:val="Compact"/>
         <w:numPr>
           <w:ilvl w:val="0"/>
-          <w:numId w:val="1003"/>
+          <w:numId w:val="1002"/>
         </w:numPr>
       </w:pPr>
       <w:r>
@@ -4837,9 +4918,6 @@
     <w:abstractNumId w:val="991"/>
   </w:num>
   <w:num w:numId="1003">
-    <w:abstractNumId w:val="991"/>
-  </w:num>
-  <w:num w:numId="1004">
     <w:abstractNumId w:val="991"/>
   </w:num>
 </w:numbering>

</xml_diff>

<commit_message>
snapshot before incorporating brightdiff curve into figure 2 also
</commit_message>
<xml_diff>
--- a/scripts/glm_analysis_test.docx
+++ b/scripts/glm_analysis_test.docx
@@ -794,7 +794,7 @@
         <w:pStyle w:val="BodyText"/>
       </w:pPr>
       <w:r>
-        <w:t xml:space="preserve">To answer whether wasps require optic flow information to discriminate patterns we tested whether they could distinguish a new artificial pattern-pair, one consisting of oblique stripes oriented at either 45 degrees to the right or to the left of the y-maze arm’s long axis and the general direction of wasp travel. Here again, we tested whether the proportion of correct choices for this pattern-pair was &gt;50% as evidence that wasps do not rely exclusively on optic flow to discriminate among stimuli. We did not run contr… (to do, incl. control data and use facet grid figure with only the bright diff and oblique data)</w:t>
+        <w:t xml:space="preserve">To answer whether wasps require optic flow information to discriminate patterns we tested whether they could distinguish a new artificial pattern-pair, one consisting of oblique stripes oriented at either 45 degrees to the right or to the left of the y-maze arm’s long axis and the general direction of wasp travel. Here again, we tested whether the proportion of correct choices for this pattern-pair was &gt;50% as evidence that wasps do not rely exclusively on optic flow to discriminate among stimuli. We did not run contr… (to do, incl. control data and use facet grid figure with only the bright diff and oblique data). also to do: add the test-control contrast table.</w:t>
       </w:r>
     </w:p>
     <w:p>
@@ -1081,7 +1081,7 @@
         <w:pStyle w:val="BodyText"/>
       </w:pPr>
       <w:r>
-        <w:t xml:space="preserve">Comparison among different artificial stimuli:</w:t>
+        <w:t xml:space="preserve">Comparison among different artificial stimuli: (to do - how does one turn this into an italics heading wth line break?)</w:t>
       </w:r>
     </w:p>
     <w:p>

</xml_diff>

<commit_message>
snapshot before adding coefficient table for artificial models
</commit_message>
<xml_diff>
--- a/scripts/glm_analysis_test.docx
+++ b/scripts/glm_analysis_test.docx
@@ -129,7 +129,7 @@
         </m:sSub>
       </m:oMath>
       <w:r>
-        <w:t xml:space="preserve">) of a correct decision (Figure 1 solid line) with every successive trial increasing the log odds of a correct decision by 0.043 (95% CI [0.019, 0.067], p &lt;0.001).</w:t>
+        <w:t xml:space="preserve">) of a correct decision (Figure 1 solid line) with every successive trial increasing the log odds of a correct decision by 0.038 (95% CI [0.016, 0.061], p &lt;0.001).</w:t>
       </w:r>
     </w:p>
     <w:p>
@@ -523,7 +523,7 @@
         <w:pStyle w:val="TableCaption"/>
       </w:pPr>
       <w:r>
-        <w:t xml:space="preserve">Q2 trial-slope summary by artificial experiment</w:t>
+        <w:t xml:space="preserve">Artificial test-control contrasts (test end vs control start)</w:t>
       </w:r>
     </w:p>
     <w:tbl>
@@ -532,14 +532,15 @@
         <w:tblW w:type="pct" w:w="5000"/>
         <w:tblLayout w:type="fixed"/>
         <w:tblLook w:firstRow="1" w:lastRow="0" w:firstColumn="0" w:lastColumn="0" w:noHBand="0" w:noVBand="0" w:val="0020"/>
-        <w:tblCaption w:val="Q2 trial-slope summary by artificial experiment"/>
+        <w:tblCaption w:val="Artificial test-control contrasts (test end vs control start)"/>
       </w:tblPr>
       <w:tblGrid>
-        <w:gridCol w:w="2127"/>
-        <w:gridCol w:w="945"/>
-        <w:gridCol w:w="2009"/>
-        <w:gridCol w:w="945"/>
-        <w:gridCol w:w="1891"/>
+        <w:gridCol w:w="1245"/>
+        <w:gridCol w:w="1601"/>
+        <w:gridCol w:w="1334"/>
+        <w:gridCol w:w="622"/>
+        <w:gridCol w:w="1779"/>
+        <w:gridCol w:w="1334"/>
       </w:tblGrid>
       <w:tr>
         <w:trPr>
@@ -550,54 +551,70 @@
           <w:p>
             <w:pPr>
               <w:pStyle w:val="Compact"/>
-            </w:pPr>
-          </w:p>
-        </w:tc>
-        <w:tc>
-          <w:tcPr/>
-          <w:p>
-            <w:pPr>
-              <w:pStyle w:val="Compact"/>
-              <w:jc w:val="left"/>
-            </w:pPr>
-            <w:r>
-              <w:t xml:space="preserve">logOdds</w:t>
-            </w:r>
-          </w:p>
-        </w:tc>
-        <w:tc>
-          <w:tcPr/>
-          <w:p>
-            <w:pPr>
-              <w:pStyle w:val="Compact"/>
-              <w:jc w:val="center"/>
-            </w:pPr>
-            <w:r>
-              <w:t xml:space="preserve">confint</w:t>
-            </w:r>
-          </w:p>
-        </w:tc>
-        <w:tc>
-          <w:tcPr/>
-          <w:p>
-            <w:pPr>
-              <w:pStyle w:val="Compact"/>
-              <w:jc w:val="center"/>
-            </w:pPr>
-            <w:r>
-              <w:t xml:space="preserve">pFmt</w:t>
-            </w:r>
-          </w:p>
-        </w:tc>
-        <w:tc>
-          <w:tcPr/>
-          <w:p>
-            <w:pPr>
-              <w:pStyle w:val="Compact"/>
-              <w:jc w:val="center"/>
-            </w:pPr>
-            <w:r>
-              <w:t xml:space="preserve">oddsMultiplier</w:t>
+              <w:jc w:val="left"/>
+            </w:pPr>
+            <w:r>
+              <w:t xml:space="preserve">Experiment</w:t>
+            </w:r>
+          </w:p>
+        </w:tc>
+        <w:tc>
+          <w:tcPr/>
+          <w:p>
+            <w:pPr>
+              <w:pStyle w:val="Compact"/>
+              <w:jc w:val="left"/>
+            </w:pPr>
+            <w:r>
+              <w:t xml:space="preserve">Log-odds contrast</w:t>
+            </w:r>
+          </w:p>
+        </w:tc>
+        <w:tc>
+          <w:tcPr/>
+          <w:p>
+            <w:pPr>
+              <w:pStyle w:val="Compact"/>
+              <w:jc w:val="left"/>
+            </w:pPr>
+            <w:r>
+              <w:t xml:space="preserve">95% CI</w:t>
+            </w:r>
+          </w:p>
+        </w:tc>
+        <w:tc>
+          <w:tcPr/>
+          <w:p>
+            <w:pPr>
+              <w:pStyle w:val="Compact"/>
+              <w:jc w:val="left"/>
+            </w:pPr>
+            <w:r>
+              <w:t xml:space="preserve">P</w:t>
+            </w:r>
+          </w:p>
+        </w:tc>
+        <w:tc>
+          <w:tcPr/>
+          <w:p>
+            <w:pPr>
+              <w:pStyle w:val="Compact"/>
+              <w:jc w:val="right"/>
+            </w:pPr>
+            <w:r>
+              <w:t xml:space="preserve">Control start trial</w:t>
+            </w:r>
+          </w:p>
+        </w:tc>
+        <w:tc>
+          <w:tcPr/>
+          <w:p>
+            <w:pPr>
+              <w:pStyle w:val="Compact"/>
+              <w:jc w:val="right"/>
+            </w:pPr>
+            <w:r>
+              <w:t xml:space="preserve">Test end trial</w:t>
             </w:r>
           </w:p>
         </w:tc>
@@ -611,102 +628,40 @@
               <w:jc w:val="left"/>
             </w:pPr>
             <w:r>
-              <w:t xml:space="preserve">brightDiff_250725</w:t>
-            </w:r>
-          </w:p>
-        </w:tc>
-        <w:tc>
-          <w:tcPr/>
-          <w:p>
-            <w:pPr>
-              <w:pStyle w:val="Compact"/>
-              <w:jc w:val="left"/>
-            </w:pPr>
-            <w:r>
-              <w:t xml:space="preserve">0.033</w:t>
-            </w:r>
-          </w:p>
-        </w:tc>
-        <w:tc>
-          <w:tcPr/>
-          <w:p>
-            <w:pPr>
-              <w:pStyle w:val="Compact"/>
-              <w:jc w:val="center"/>
-            </w:pPr>
-            <w:r>
-              <w:t xml:space="preserve">[-0.037, 0.103]</w:t>
-            </w:r>
-          </w:p>
-        </w:tc>
-        <w:tc>
-          <w:tcPr/>
-          <w:p>
-            <w:pPr>
-              <w:pStyle w:val="Compact"/>
-              <w:jc w:val="center"/>
-            </w:pPr>
-            <w:r>
-              <w:t xml:space="preserve">0.356</w:t>
-            </w:r>
-          </w:p>
-        </w:tc>
-        <w:tc>
-          <w:tcPr/>
-          <w:p>
-            <w:pPr>
-              <w:pStyle w:val="Compact"/>
-              <w:jc w:val="center"/>
-            </w:pPr>
-            <w:r>
-              <w:t xml:space="preserve">1.033</w:t>
-            </w:r>
-          </w:p>
-        </w:tc>
-      </w:tr>
-      <w:tr>
-        <w:tc>
-          <w:tcPr/>
-          <w:p>
-            <w:pPr>
-              <w:pStyle w:val="Compact"/>
-              <w:jc w:val="left"/>
-            </w:pPr>
-            <w:r>
-              <w:t xml:space="preserve">perpPara_170725</w:t>
-            </w:r>
-          </w:p>
-        </w:tc>
-        <w:tc>
-          <w:tcPr/>
-          <w:p>
-            <w:pPr>
-              <w:pStyle w:val="Compact"/>
-              <w:jc w:val="left"/>
-            </w:pPr>
-            <w:r>
-              <w:t xml:space="preserve">0.043</w:t>
-            </w:r>
-          </w:p>
-        </w:tc>
-        <w:tc>
-          <w:tcPr/>
-          <w:p>
-            <w:pPr>
-              <w:pStyle w:val="Compact"/>
-              <w:jc w:val="center"/>
-            </w:pPr>
-            <w:r>
-              <w:t xml:space="preserve">[0.019, 0.067]</w:t>
-            </w:r>
-          </w:p>
-        </w:tc>
-        <w:tc>
-          <w:tcPr/>
-          <w:p>
-            <w:pPr>
-              <w:pStyle w:val="Compact"/>
-              <w:jc w:val="center"/>
+              <w:t xml:space="preserve">thinOb_150823</w:t>
+            </w:r>
+          </w:p>
+        </w:tc>
+        <w:tc>
+          <w:tcPr/>
+          <w:p>
+            <w:pPr>
+              <w:pStyle w:val="Compact"/>
+              <w:jc w:val="left"/>
+            </w:pPr>
+            <w:r>
+              <w:t xml:space="preserve">1.954</w:t>
+            </w:r>
+          </w:p>
+        </w:tc>
+        <w:tc>
+          <w:tcPr/>
+          <w:p>
+            <w:pPr>
+              <w:pStyle w:val="Compact"/>
+              <w:jc w:val="left"/>
+            </w:pPr>
+            <w:r>
+              <w:t xml:space="preserve">[0.907, 3.002]</w:t>
+            </w:r>
+          </w:p>
+        </w:tc>
+        <w:tc>
+          <w:tcPr/>
+          <w:p>
+            <w:pPr>
+              <w:pStyle w:val="Compact"/>
+              <w:jc w:val="left"/>
             </w:pPr>
             <w:r>
               <w:t xml:space="preserve">&lt;0.001</w:t>
@@ -718,72 +673,22 @@
           <w:p>
             <w:pPr>
               <w:pStyle w:val="Compact"/>
-              <w:jc w:val="center"/>
-            </w:pPr>
-            <w:r>
-              <w:t xml:space="preserve">1.044</w:t>
-            </w:r>
-          </w:p>
-        </w:tc>
-      </w:tr>
-      <w:tr>
-        <w:tc>
-          <w:tcPr/>
-          <w:p>
-            <w:pPr>
-              <w:pStyle w:val="Compact"/>
-              <w:jc w:val="left"/>
-            </w:pPr>
-            <w:r>
-              <w:t xml:space="preserve">thinOb_150823</w:t>
-            </w:r>
-          </w:p>
-        </w:tc>
-        <w:tc>
-          <w:tcPr/>
-          <w:p>
-            <w:pPr>
-              <w:pStyle w:val="Compact"/>
-              <w:jc w:val="left"/>
-            </w:pPr>
-            <w:r>
-              <w:t xml:space="preserve">0.029</w:t>
-            </w:r>
-          </w:p>
-        </w:tc>
-        <w:tc>
-          <w:tcPr/>
-          <w:p>
-            <w:pPr>
-              <w:pStyle w:val="Compact"/>
-              <w:jc w:val="center"/>
-            </w:pPr>
-            <w:r>
-              <w:t xml:space="preserve">[0.015, 0.044]</w:t>
-            </w:r>
-          </w:p>
-        </w:tc>
-        <w:tc>
-          <w:tcPr/>
-          <w:p>
-            <w:pPr>
-              <w:pStyle w:val="Compact"/>
-              <w:jc w:val="center"/>
-            </w:pPr>
-            <w:r>
-              <w:t xml:space="preserve">&lt;0.001</w:t>
-            </w:r>
-          </w:p>
-        </w:tc>
-        <w:tc>
-          <w:tcPr/>
-          <w:p>
-            <w:pPr>
-              <w:pStyle w:val="Compact"/>
-              <w:jc w:val="center"/>
-            </w:pPr>
-            <w:r>
-              <w:t xml:space="preserve">1.030</w:t>
+              <w:jc w:val="right"/>
+            </w:pPr>
+            <w:r>
+              <w:t xml:space="preserve">1</w:t>
+            </w:r>
+          </w:p>
+        </w:tc>
+        <w:tc>
+          <w:tcPr/>
+          <w:p>
+            <w:pPr>
+              <w:pStyle w:val="Compact"/>
+              <w:jc w:val="right"/>
+            </w:pPr>
+            <w:r>
+              <w:t xml:space="preserve">66</w:t>
             </w:r>
           </w:p>
         </w:tc>
@@ -794,15 +699,7 @@
         <w:pStyle w:val="BodyText"/>
       </w:pPr>
       <w:r>
-        <w:t xml:space="preserve">To answer whether wasps require optic flow information to discriminate patterns we tested whether they could distinguish a new artificial pattern-pair, one consisting of oblique stripes oriented at either 45 degrees to the right or to the left of the y-maze arm’s long axis and the general direction of wasp travel. Here again, we tested whether the proportion of correct choices for this pattern-pair was &gt;50% as evidence that wasps do not rely exclusively on optic flow to discriminate among stimuli. We did not run contr… (to do, incl. control data and use facet grid figure with only the bright diff and oblique data). also to do: add the test-control contrast table.</w:t>
-      </w:r>
-    </w:p>
-    <w:p>
-      <w:pPr>
-        <w:pStyle w:val="BodyText"/>
-      </w:pPr>
-      <w:r>
-        <w:t xml:space="preserve">Wasps had no trouble distinguishing between oblique stripes that presumably produce identical rates of optic flow in the dorsal visual field (Figure 2). Similar to the perpendicular-parallel experiment, trial had a significant positive effect on</w:t>
+        <w:t xml:space="preserve">To answer whether wasps require optic flow information to discriminate patterns we tested whether they could distinguish a new artificial pattern-pair, one consisting of oblique stripes oriented at either 45 degrees to the right or to the left of the y-maze arm’s long axis and the general direction of wasp travel. Here again, evidence that wasps can distinguish stimuli that generate identical rates of optic flow is evidenced by a</w:t>
       </w:r>
       <w:r>
         <w:t xml:space="preserve"> </w:t>
@@ -843,7 +740,13 @@
         </m:sSub>
       </m:oMath>
       <w:r>
-        <w:t xml:space="preserve">, with every successive trial increasing the log odds of a correct decision by 0.029 (95% CI [0.015, 0.044], p &lt;0.001; Table 1). Initially (at trial 1) performance was not significantly different from chance (</w:t>
+        <w:t xml:space="preserve"> </w:t>
+      </w:r>
+      <w:r>
+        <w:t xml:space="preserve">&gt;50% and a larger</w:t>
+      </w:r>
+      <w:r>
+        <w:t xml:space="preserve"> </w:t>
       </w:r>
       <m:oMath>
         <m:sSub>
@@ -884,7 +787,141 @@
         <w:t xml:space="preserve"> </w:t>
       </w:r>
       <w:r>
+        <w:t xml:space="preserve">at the end of the test relative to the start of the control.</w:t>
+      </w:r>
+    </w:p>
+    <w:p>
+      <w:pPr>
+        <w:pStyle w:val="BodyText"/>
+      </w:pPr>
+      <w:r>
+        <w:t xml:space="preserve">Wasps had no trouble distinguishing between oblique stripes that presumably produce identical rates of optic flow in the dorsal visual field (Figure 2). Similar to the perpendicular-parallel experiment, trial had a significant positive effect on</w:t>
+      </w:r>
+      <w:r>
+        <w:t xml:space="preserve"> </w:t>
+      </w:r>
+      <m:oMath>
+        <m:sSub>
+          <m:e>
+            <m:r>
+              <m:t>P</m:t>
+            </m:r>
+          </m:e>
+          <m:sub>
+            <m:r>
+              <m:rPr>
+                <m:sty m:val="p"/>
+              </m:rPr>
+              <m:t>c</m:t>
+            </m:r>
+            <m:r>
+              <m:rPr>
+                <m:sty m:val="p"/>
+              </m:rPr>
+              <m:t>o</m:t>
+            </m:r>
+            <m:r>
+              <m:rPr>
+                <m:sty m:val="p"/>
+              </m:rPr>
+              <m:t>r</m:t>
+            </m:r>
+            <m:r>
+              <m:rPr>
+                <m:sty m:val="p"/>
+              </m:rPr>
+              <m:t>r</m:t>
+            </m:r>
+          </m:sub>
+        </m:sSub>
+      </m:oMath>
+      <w:r>
+        <w:t xml:space="preserve">, with every successive trial increasing the log odds of a correct decision by 0.029 (95% CI [0.015, 0.044], p &lt;0.001; Table 1). Initially (at trial 1) performance was not significantly different from chance (</w:t>
+      </w:r>
+      <m:oMath>
+        <m:sSub>
+          <m:e>
+            <m:r>
+              <m:t>P</m:t>
+            </m:r>
+          </m:e>
+          <m:sub>
+            <m:r>
+              <m:rPr>
+                <m:sty m:val="p"/>
+              </m:rPr>
+              <m:t>c</m:t>
+            </m:r>
+            <m:r>
+              <m:rPr>
+                <m:sty m:val="p"/>
+              </m:rPr>
+              <m:t>o</m:t>
+            </m:r>
+            <m:r>
+              <m:rPr>
+                <m:sty m:val="p"/>
+              </m:rPr>
+              <m:t>r</m:t>
+            </m:r>
+            <m:r>
+              <m:rPr>
+                <m:sty m:val="p"/>
+              </m:rPr>
+              <m:t>r</m:t>
+            </m:r>
+          </m:sub>
+        </m:sSub>
+      </m:oMath>
+      <w:r>
+        <w:t xml:space="preserve"> </w:t>
+      </w:r>
+      <w:r>
         <w:t xml:space="preserve">= 0.521, 95% CI [0.409, 0.631]) but rose steeply, reaching 0.880 (95% CI [0.796, 0.932]) by the end of the experiment (trial 66), which is significantly higher than expected by chance (50%).</w:t>
+      </w:r>
+      <w:r>
+        <w:t xml:space="preserve"> </w:t>
+      </w:r>
+      <m:oMath>
+        <m:sSub>
+          <m:e>
+            <m:r>
+              <m:t>P</m:t>
+            </m:r>
+          </m:e>
+          <m:sub>
+            <m:r>
+              <m:rPr>
+                <m:sty m:val="p"/>
+              </m:rPr>
+              <m:t>c</m:t>
+            </m:r>
+            <m:r>
+              <m:rPr>
+                <m:sty m:val="p"/>
+              </m:rPr>
+              <m:t>o</m:t>
+            </m:r>
+            <m:r>
+              <m:rPr>
+                <m:sty m:val="p"/>
+              </m:rPr>
+              <m:t>r</m:t>
+            </m:r>
+            <m:r>
+              <m:rPr>
+                <m:sty m:val="p"/>
+              </m:rPr>
+              <m:t>r</m:t>
+            </m:r>
+          </m:sub>
+        </m:sSub>
+      </m:oMath>
+      <w:r>
+        <w:t xml:space="preserve"> </w:t>
+      </w:r>
+      <w:r>
+        <w:t xml:space="preserve">at the end of the test phase of experiment was also higher than in the control (insert stats here).</w:t>
       </w:r>
     </w:p>
     <w:p>
@@ -2999,6 +3036,12 @@
       <w:r>
         <w:t xml:space="preserve">- what is the logic behind when / where to reference tables and figures in line?</w:t>
       </w:r>
+      <w:r>
+        <w:t xml:space="preserve"> </w:t>
+      </w:r>
+      <w:r>
+        <w:t xml:space="preserve">- we need figure captions</w:t>
+      </w:r>
     </w:p>
     <w:p>
       <w:pPr>
@@ -3384,70 +3427,70 @@
         <w:rPr>
           <w:rStyle w:val="VerbatimChar"/>
         </w:rPr>
-        <w:t xml:space="preserve">|experiment      |logOddsRatio |confint         |pFmt   | controlStartTrial| testEndTrial|</w:t>
-      </w:r>
-      <w:r>
-        <w:br/>
-      </w:r>
-      <w:r>
-        <w:rPr>
-          <w:rStyle w:val="VerbatimChar"/>
-        </w:rPr>
-        <w:t xml:space="preserve">|:---------------|:------------|:---------------|:------|-----------------:|------------:|</w:t>
-      </w:r>
-      <w:r>
-        <w:br/>
-      </w:r>
-      <w:r>
-        <w:rPr>
-          <w:rStyle w:val="VerbatimChar"/>
-        </w:rPr>
-        <w:t xml:space="preserve">|natcan1_170923  |0.771        |[-0.494, 2.036] |0.232  |                 1|          119|</w:t>
-      </w:r>
-      <w:r>
-        <w:br/>
-      </w:r>
-      <w:r>
-        <w:rPr>
-          <w:rStyle w:val="VerbatimChar"/>
-        </w:rPr>
-        <w:t xml:space="preserve">|natcan3_080825  |0.265        |[-0.538, 1.068] |0.518  |                 1|           64|</w:t>
-      </w:r>
-      <w:r>
-        <w:br/>
-      </w:r>
-      <w:r>
-        <w:rPr>
-          <w:rStyle w:val="VerbatimChar"/>
-        </w:rPr>
-        <w:t xml:space="preserve">|natcan3_190925  |1.072        |[0.164, 1.980]  |0.021  |                 1|          131|</w:t>
-      </w:r>
-      <w:r>
-        <w:br/>
-      </w:r>
-      <w:r>
-        <w:rPr>
-          <w:rStyle w:val="VerbatimChar"/>
-        </w:rPr>
-        <w:t xml:space="preserve">|natcan4_180825  |-0.431       |[-1.381, 0.519] |0.374  |                 1|          100|</w:t>
-      </w:r>
-      <w:r>
-        <w:br/>
-      </w:r>
-      <w:r>
-        <w:rPr>
-          <w:rStyle w:val="VerbatimChar"/>
-        </w:rPr>
-        <w:t xml:space="preserve">|perpPara_170725 |1.968        |[0.881, 3.055]  |&lt;0.001 |                 1|           47|</w:t>
-      </w:r>
-      <w:r>
-        <w:br/>
-      </w:r>
-      <w:r>
-        <w:rPr>
-          <w:rStyle w:val="VerbatimChar"/>
-        </w:rPr>
-        <w:t xml:space="preserve">|thinOb_150823   |1.954        |[0.907, 3.002]  |&lt;0.001 |                 1|           66|</w:t>
+        <w:t xml:space="preserve">|experiment      |nat_or_art   |logOddsRatio |confint         |pFmt   | controlStartTrial| testEndTrial|</w:t>
+      </w:r>
+      <w:r>
+        <w:br/>
+      </w:r>
+      <w:r>
+        <w:rPr>
+          <w:rStyle w:val="VerbatimChar"/>
+        </w:rPr>
+        <w:t xml:space="preserve">|:---------------|:------------|:------------|:---------------|:------|-----------------:|------------:|</w:t>
+      </w:r>
+      <w:r>
+        <w:br/>
+      </w:r>
+      <w:r>
+        <w:rPr>
+          <w:rStyle w:val="VerbatimChar"/>
+        </w:rPr>
+        <w:t xml:space="preserve">|natcan1_170923  |naturalistic |0.771        |[-0.494, 2.036] |0.232  |                 1|          119|</w:t>
+      </w:r>
+      <w:r>
+        <w:br/>
+      </w:r>
+      <w:r>
+        <w:rPr>
+          <w:rStyle w:val="VerbatimChar"/>
+        </w:rPr>
+        <w:t xml:space="preserve">|natcan3_080825  |naturalistic |0.265        |[-0.538, 1.068] |0.518  |                 1|           64|</w:t>
+      </w:r>
+      <w:r>
+        <w:br/>
+      </w:r>
+      <w:r>
+        <w:rPr>
+          <w:rStyle w:val="VerbatimChar"/>
+        </w:rPr>
+        <w:t xml:space="preserve">|natcan3_190925  |naturalistic |1.072        |[0.164, 1.980]  |0.021  |                 1|          131|</w:t>
+      </w:r>
+      <w:r>
+        <w:br/>
+      </w:r>
+      <w:r>
+        <w:rPr>
+          <w:rStyle w:val="VerbatimChar"/>
+        </w:rPr>
+        <w:t xml:space="preserve">|natcan4_180825  |naturalistic |-0.431       |[-1.381, 0.519] |0.374  |                 1|          100|</w:t>
+      </w:r>
+      <w:r>
+        <w:br/>
+      </w:r>
+      <w:r>
+        <w:rPr>
+          <w:rStyle w:val="VerbatimChar"/>
+        </w:rPr>
+        <w:t xml:space="preserve">|perpPara_170725 |artificial   |1.968        |[0.881, 3.055]  |&lt;0.001 |                 1|           47|</w:t>
+      </w:r>
+      <w:r>
+        <w:br/>
+      </w:r>
+      <w:r>
+        <w:rPr>
+          <w:rStyle w:val="VerbatimChar"/>
+        </w:rPr>
+        <w:t xml:space="preserve">|thinOb_150823   |artificial   |1.954        |[0.907, 3.002]  |&lt;0.001 |                 1|           66|</w:t>
       </w:r>
       <w:r>
         <w:br/>
@@ -3612,106 +3655,70 @@
         <w:rPr>
           <w:rStyle w:val="VerbatimChar"/>
         </w:rPr>
-        <w:t xml:space="preserve">|experiment        |nat_or_art   |logOdds |confint         |pFmt   |oddsMultiplier |</w:t>
-      </w:r>
-      <w:r>
-        <w:br/>
-      </w:r>
-      <w:r>
-        <w:rPr>
-          <w:rStyle w:val="VerbatimChar"/>
-        </w:rPr>
-        <w:t xml:space="preserve">|:-----------------|:------------|:-------|:---------------|:------|:--------------|</w:t>
-      </w:r>
-      <w:r>
-        <w:br/>
-      </w:r>
-      <w:r>
-        <w:rPr>
-          <w:rStyle w:val="VerbatimChar"/>
-        </w:rPr>
-        <w:t xml:space="preserve">|brightDiff_250725 |artificial   |0.033   |[-0.037, 0.103] |0.356  |1.033          |</w:t>
-      </w:r>
-      <w:r>
-        <w:br/>
-      </w:r>
-      <w:r>
-        <w:rPr>
-          <w:rStyle w:val="VerbatimChar"/>
-        </w:rPr>
-        <w:t xml:space="preserve">|perpPara_170725   |artificial   |0.043   |[0.019, 0.067]  |&lt;0.001 |1.044          |</w:t>
-      </w:r>
-      <w:r>
-        <w:br/>
-      </w:r>
-      <w:r>
-        <w:rPr>
-          <w:rStyle w:val="VerbatimChar"/>
-        </w:rPr>
-        <w:t xml:space="preserve">|thinOb_150823     |artificial   |0.029   |[0.015, 0.044]  |&lt;0.001 |1.030          |</w:t>
-      </w:r>
-      <w:r>
-        <w:br/>
-      </w:r>
-      <w:r>
-        <w:rPr>
-          <w:rStyle w:val="VerbatimChar"/>
-        </w:rPr>
-        <w:t xml:space="preserve">|natcan1_170923    |naturalistic |0.004   |[-0.002, 0.010] |0.153  |1.004          |</w:t>
-      </w:r>
-      <w:r>
-        <w:br/>
-      </w:r>
-      <w:r>
-        <w:rPr>
-          <w:rStyle w:val="VerbatimChar"/>
-        </w:rPr>
-        <w:t xml:space="preserve">|natcan2_300725    |naturalistic |0.001   |[-0.008, 0.010] |0.832  |1.001          |</w:t>
-      </w:r>
-      <w:r>
-        <w:br/>
-      </w:r>
-      <w:r>
-        <w:rPr>
-          <w:rStyle w:val="VerbatimChar"/>
-        </w:rPr>
-        <w:t xml:space="preserve">|natcan3_080825    |naturalistic |0.007   |[-0.004, 0.018] |0.195  |1.007          |</w:t>
-      </w:r>
-      <w:r>
-        <w:br/>
-      </w:r>
-      <w:r>
-        <w:rPr>
-          <w:rStyle w:val="VerbatimChar"/>
-        </w:rPr>
-        <w:t xml:space="preserve">|natcan3_190925    |naturalistic |0.005   |[0.001, 0.009]  |0.013  |1.005          |</w:t>
-      </w:r>
-      <w:r>
-        <w:br/>
-      </w:r>
-      <w:r>
-        <w:rPr>
-          <w:rStyle w:val="VerbatimChar"/>
-        </w:rPr>
-        <w:t xml:space="preserve">|natcan4_180825    |naturalistic |-0.005  |[-0.012, 0.001] |0.122  |0.995          |</w:t>
-      </w:r>
-      <w:r>
-        <w:br/>
-      </w:r>
-      <w:r>
-        <w:rPr>
-          <w:rStyle w:val="VerbatimChar"/>
-        </w:rPr>
-        <w:t xml:space="preserve">|natcan5_290825    |naturalistic |0.004   |[-0.005, 0.013] |0.412  |1.004          |</w:t>
-      </w:r>
-      <w:r>
-        <w:br/>
-      </w:r>
-      <w:r>
-        <w:rPr>
-          <w:rStyle w:val="VerbatimChar"/>
-        </w:rPr>
-        <w:t xml:space="preserve">|natcan6_070925    |naturalistic |-0.002  |[-0.010, 0.006] |0.647  |0.998          |</w:t>
+        <w:t xml:space="preserve">|experiment      |nat_or_art   |logOdds |confint         |pFmt   |oddsMultiplier |</w:t>
+      </w:r>
+      <w:r>
+        <w:br/>
+      </w:r>
+      <w:r>
+        <w:rPr>
+          <w:rStyle w:val="VerbatimChar"/>
+        </w:rPr>
+        <w:t xml:space="preserve">|:---------------|:------------|:-------|:---------------|:------|:--------------|</w:t>
+      </w:r>
+      <w:r>
+        <w:br/>
+      </w:r>
+      <w:r>
+        <w:rPr>
+          <w:rStyle w:val="VerbatimChar"/>
+        </w:rPr>
+        <w:t xml:space="preserve">|perpPara_170725 |artificial   |0.038   |[0.016, 0.061]  |&lt;0.001 |1.039          |</w:t>
+      </w:r>
+      <w:r>
+        <w:br/>
+      </w:r>
+      <w:r>
+        <w:rPr>
+          <w:rStyle w:val="VerbatimChar"/>
+        </w:rPr>
+        <w:t xml:space="preserve">|thinOb_150823   |artificial   |0.028   |[0.014, 0.042]  |&lt;0.001 |1.029          |</w:t>
+      </w:r>
+      <w:r>
+        <w:br/>
+      </w:r>
+      <w:r>
+        <w:rPr>
+          <w:rStyle w:val="VerbatimChar"/>
+        </w:rPr>
+        <w:t xml:space="preserve">|natcan1_170923  |naturalistic |0.004   |[-0.002, 0.010] |0.168  |1.004          |</w:t>
+      </w:r>
+      <w:r>
+        <w:br/>
+      </w:r>
+      <w:r>
+        <w:rPr>
+          <w:rStyle w:val="VerbatimChar"/>
+        </w:rPr>
+        <w:t xml:space="preserve">|natcan3_080825  |naturalistic |0.007   |[-0.003, 0.018] |0.182  |1.007          |</w:t>
+      </w:r>
+      <w:r>
+        <w:br/>
+      </w:r>
+      <w:r>
+        <w:rPr>
+          <w:rStyle w:val="VerbatimChar"/>
+        </w:rPr>
+        <w:t xml:space="preserve">|natcan3_190925  |naturalistic |0.005   |[0.001, 0.009]  |0.016  |1.005          |</w:t>
+      </w:r>
+      <w:r>
+        <w:br/>
+      </w:r>
+      <w:r>
+        <w:rPr>
+          <w:rStyle w:val="VerbatimChar"/>
+        </w:rPr>
+        <w:t xml:space="preserve">|natcan4_180825  |naturalistic |-0.005  |[-0.012, 0.001] |0.120  |0.995          |</w:t>
       </w:r>
       <w:r>
         <w:br/>
@@ -4236,466 +4243,394 @@
         <w:rPr>
           <w:rStyle w:val="VerbatimChar"/>
         </w:rPr>
-        <w:t xml:space="preserve">|experiment        |nat_or_art   |term              |logOdds |confint          |pFmt   |</w:t>
-      </w:r>
-      <w:r>
-        <w:br/>
-      </w:r>
-      <w:r>
-        <w:rPr>
-          <w:rStyle w:val="VerbatimChar"/>
-        </w:rPr>
-        <w:t xml:space="preserve">|:-----------------|:------------|:-----------------|:-------|:----------------|:------|</w:t>
-      </w:r>
-      <w:r>
-        <w:br/>
-      </w:r>
-      <w:r>
-        <w:rPr>
-          <w:rStyle w:val="VerbatimChar"/>
-        </w:rPr>
-        <w:t xml:space="preserve">|brightDiff_250725 |artificial   |(Intercept)       |1.049   |[0.101, 1.997]   |0.030  |</w:t>
-      </w:r>
-      <w:r>
-        <w:br/>
-      </w:r>
-      <w:r>
-        <w:rPr>
-          <w:rStyle w:val="VerbatimChar"/>
-        </w:rPr>
-        <w:t xml:space="preserve">|brightDiff_250725 |artificial   |rank_trial        |0.033   |[-0.037, 0.103]  |0.356  |</w:t>
-      </w:r>
-      <w:r>
-        <w:br/>
-      </w:r>
-      <w:r>
-        <w:rPr>
-          <w:rStyle w:val="VerbatimChar"/>
-        </w:rPr>
-        <w:t xml:space="preserve">|brightDiff_250725 |artificial   |sideAlt_trialTRUE |-0.381  |[-1.212, 0.450]  |0.369  |</w:t>
-      </w:r>
-      <w:r>
-        <w:br/>
-      </w:r>
-      <w:r>
-        <w:rPr>
-          <w:rStyle w:val="VerbatimChar"/>
-        </w:rPr>
-        <w:t xml:space="preserve">|brightDiff_250725 |artificial   |reward_sideR      |-0.892  |[-1.760, -0.024] |0.044  |</w:t>
-      </w:r>
-      <w:r>
-        <w:br/>
-      </w:r>
-      <w:r>
-        <w:rPr>
-          <w:rStyle w:val="VerbatimChar"/>
-        </w:rPr>
-        <w:t xml:space="preserve">|brightDiff_250725 |artificial   |sd__(Intercept)   |0.000   |[NA, NA]         |NA     |</w:t>
-      </w:r>
-      <w:r>
-        <w:br/>
-      </w:r>
-      <w:r>
-        <w:rPr>
-          <w:rStyle w:val="VerbatimChar"/>
-        </w:rPr>
-        <w:t xml:space="preserve">|perpPara_170725   |artificial   |(Intercept)       |1.130   |[0.385, 1.876]   |0.003  |</w:t>
-      </w:r>
-      <w:r>
-        <w:br/>
-      </w:r>
-      <w:r>
-        <w:rPr>
-          <w:rStyle w:val="VerbatimChar"/>
-        </w:rPr>
-        <w:t xml:space="preserve">|perpPara_170725   |artificial   |rank_trial        |0.043   |[0.019, 0.067]   |&lt;0.001 |</w:t>
-      </w:r>
-      <w:r>
-        <w:br/>
-      </w:r>
-      <w:r>
-        <w:rPr>
-          <w:rStyle w:val="VerbatimChar"/>
-        </w:rPr>
-        <w:t xml:space="preserve">|perpPara_170725   |artificial   |sideAlt_trialTRUE |0.141   |[-0.438, 0.721]  |0.633  |</w:t>
-      </w:r>
-      <w:r>
-        <w:br/>
-      </w:r>
-      <w:r>
-        <w:rPr>
-          <w:rStyle w:val="VerbatimChar"/>
-        </w:rPr>
-        <w:t xml:space="preserve">|perpPara_170725   |artificial   |reward_sideR      |-1.479  |[-2.070, -0.888] |&lt;0.001 |</w:t>
-      </w:r>
-      <w:r>
-        <w:br/>
-      </w:r>
-      <w:r>
-        <w:rPr>
-          <w:rStyle w:val="VerbatimChar"/>
-        </w:rPr>
-        <w:t xml:space="preserve">|perpPara_170725   |artificial   |sd__(Intercept)   |0.496   |[NA, NA]         |NA     |</w:t>
-      </w:r>
-      <w:r>
-        <w:br/>
-      </w:r>
-      <w:r>
-        <w:rPr>
-          <w:rStyle w:val="VerbatimChar"/>
-        </w:rPr>
-        <w:t xml:space="preserve">|thinOb_150823     |artificial   |(Intercept)       |-1.122  |[-1.709, -0.535] |&lt;0.001 |</w:t>
-      </w:r>
-      <w:r>
-        <w:br/>
-      </w:r>
-      <w:r>
-        <w:rPr>
-          <w:rStyle w:val="VerbatimChar"/>
-        </w:rPr>
-        <w:t xml:space="preserve">|thinOb_150823     |artificial   |rank_trial        |0.029   |[0.015, 0.044]   |&lt;0.001 |</w:t>
-      </w:r>
-      <w:r>
-        <w:br/>
-      </w:r>
-      <w:r>
-        <w:rPr>
-          <w:rStyle w:val="VerbatimChar"/>
-        </w:rPr>
-        <w:t xml:space="preserve">|thinOb_150823     |artificial   |sideAlt_trialTRUE |0.021   |[-0.464, 0.505]  |0.933  |</w:t>
-      </w:r>
-      <w:r>
-        <w:br/>
-      </w:r>
-      <w:r>
-        <w:rPr>
-          <w:rStyle w:val="VerbatimChar"/>
-        </w:rPr>
-        <w:t xml:space="preserve">|thinOb_150823     |artificial   |reward_sideR      |2.330   |[1.801, 2.860]   |&lt;0.001 |</w:t>
-      </w:r>
-      <w:r>
-        <w:br/>
-      </w:r>
-      <w:r>
-        <w:rPr>
-          <w:rStyle w:val="VerbatimChar"/>
-        </w:rPr>
-        <w:t xml:space="preserve">|thinOb_150823     |artificial   |sd__(Intercept)   |0.000   |[NA, NA]         |NA     |</w:t>
-      </w:r>
-      <w:r>
-        <w:br/>
-      </w:r>
-      <w:r>
-        <w:rPr>
-          <w:rStyle w:val="VerbatimChar"/>
-        </w:rPr>
-        <w:t xml:space="preserve">|natcan1_170923    |naturalistic |(Intercept)       |-0.090  |[-0.520, 0.341]  |0.683  |</w:t>
-      </w:r>
-      <w:r>
-        <w:br/>
-      </w:r>
-      <w:r>
-        <w:rPr>
-          <w:rStyle w:val="VerbatimChar"/>
-        </w:rPr>
-        <w:t xml:space="preserve">|natcan1_170923    |naturalistic |rank_trial        |0.004   |[-0.002, 0.010]  |0.153  |</w:t>
-      </w:r>
-      <w:r>
-        <w:br/>
-      </w:r>
-      <w:r>
-        <w:rPr>
-          <w:rStyle w:val="VerbatimChar"/>
-        </w:rPr>
-        <w:t xml:space="preserve">|natcan1_170923    |naturalistic |sideAlt_trialTRUE |0.204   |[-0.161, 0.569]  |0.273  |</w:t>
-      </w:r>
-      <w:r>
-        <w:br/>
-      </w:r>
-      <w:r>
-        <w:rPr>
-          <w:rStyle w:val="VerbatimChar"/>
-        </w:rPr>
-        <w:t xml:space="preserve">|natcan1_170923    |naturalistic |reward_sideR      |0.781   |[0.416, 1.146]   |&lt;0.001 |</w:t>
-      </w:r>
-      <w:r>
-        <w:br/>
-      </w:r>
-      <w:r>
-        <w:rPr>
-          <w:rStyle w:val="VerbatimChar"/>
-        </w:rPr>
-        <w:t xml:space="preserve">|natcan1_170923    |naturalistic |sd__(Intercept)   |0.159   |[NA, NA]         |NA     |</w:t>
-      </w:r>
-      <w:r>
-        <w:br/>
-      </w:r>
-      <w:r>
-        <w:rPr>
-          <w:rStyle w:val="VerbatimChar"/>
-        </w:rPr>
-        <w:t xml:space="preserve">|natcan2_300725    |naturalistic |(Intercept)       |-0.524  |[-0.930, -0.118] |0.011  |</w:t>
-      </w:r>
-      <w:r>
-        <w:br/>
-      </w:r>
-      <w:r>
-        <w:rPr>
-          <w:rStyle w:val="VerbatimChar"/>
-        </w:rPr>
-        <w:t xml:space="preserve">|natcan2_300725    |naturalistic |rank_trial        |0.001   |[-0.008, 0.010]  |0.832  |</w:t>
-      </w:r>
-      <w:r>
-        <w:br/>
-      </w:r>
-      <w:r>
-        <w:rPr>
-          <w:rStyle w:val="VerbatimChar"/>
-        </w:rPr>
-        <w:t xml:space="preserve">|natcan2_300725    |naturalistic |sideAlt_trialTRUE |0.048   |[-0.315, 0.412]  |0.794  |</w:t>
-      </w:r>
-      <w:r>
-        <w:br/>
-      </w:r>
-      <w:r>
-        <w:rPr>
-          <w:rStyle w:val="VerbatimChar"/>
-        </w:rPr>
-        <w:t xml:space="preserve">|natcan2_300725    |naturalistic |reward_sideR      |0.940   |[0.581, 1.299]   |&lt;0.001 |</w:t>
-      </w:r>
-      <w:r>
-        <w:br/>
-      </w:r>
-      <w:r>
-        <w:rPr>
-          <w:rStyle w:val="VerbatimChar"/>
-        </w:rPr>
-        <w:t xml:space="preserve">|natcan2_300725    |naturalistic |sd__(Intercept)   |0.122   |[NA, NA]         |NA     |</w:t>
-      </w:r>
-      <w:r>
-        <w:br/>
-      </w:r>
-      <w:r>
-        <w:rPr>
-          <w:rStyle w:val="VerbatimChar"/>
-        </w:rPr>
-        <w:t xml:space="preserve">|natcan3_080825    |naturalistic |(Intercept)       |0.388   |[-0.031, 0.808]  |0.070  |</w:t>
-      </w:r>
-      <w:r>
-        <w:br/>
-      </w:r>
-      <w:r>
-        <w:rPr>
-          <w:rStyle w:val="VerbatimChar"/>
-        </w:rPr>
-        <w:t xml:space="preserve">|natcan3_080825    |naturalistic |rank_trial        |0.007   |[-0.004, 0.018]  |0.195  |</w:t>
-      </w:r>
-      <w:r>
-        <w:br/>
-      </w:r>
-      <w:r>
-        <w:rPr>
-          <w:rStyle w:val="VerbatimChar"/>
-        </w:rPr>
-        <w:t xml:space="preserve">|natcan3_080825    |naturalistic |sideAlt_trialTRUE |-0.211  |[-0.573, 0.152]  |0.255  |</w:t>
-      </w:r>
-      <w:r>
-        <w:br/>
-      </w:r>
-      <w:r>
-        <w:rPr>
-          <w:rStyle w:val="VerbatimChar"/>
-        </w:rPr>
-        <w:t xml:space="preserve">|natcan3_080825    |naturalistic |reward_sideR      |-0.629  |[-0.992, -0.266] |&lt;0.001 |</w:t>
-      </w:r>
-      <w:r>
-        <w:br/>
-      </w:r>
-      <w:r>
-        <w:rPr>
-          <w:rStyle w:val="VerbatimChar"/>
-        </w:rPr>
-        <w:t xml:space="preserve">|natcan3_080825    |naturalistic |sd__(Intercept)   |0.089   |[NA, NA]         |NA     |</w:t>
-      </w:r>
-      <w:r>
-        <w:br/>
-      </w:r>
-      <w:r>
-        <w:rPr>
-          <w:rStyle w:val="VerbatimChar"/>
-        </w:rPr>
-        <w:t xml:space="preserve">|natcan3_190925    |naturalistic |(Intercept)       |-0.036  |[-0.334, 0.262]  |0.812  |</w:t>
-      </w:r>
-      <w:r>
-        <w:br/>
-      </w:r>
-      <w:r>
-        <w:rPr>
-          <w:rStyle w:val="VerbatimChar"/>
-        </w:rPr>
-        <w:t xml:space="preserve">|natcan3_190925    |naturalistic |rank_trial        |0.005   |[0.001, 0.009]   |0.013  |</w:t>
-      </w:r>
-      <w:r>
-        <w:br/>
-      </w:r>
-      <w:r>
-        <w:rPr>
-          <w:rStyle w:val="VerbatimChar"/>
-        </w:rPr>
-        <w:t xml:space="preserve">|natcan3_190925    |naturalistic |sideAlt_trialTRUE |-0.034  |[-0.287, 0.220]  |0.795  |</w:t>
-      </w:r>
-      <w:r>
-        <w:br/>
-      </w:r>
-      <w:r>
-        <w:rPr>
-          <w:rStyle w:val="VerbatimChar"/>
-        </w:rPr>
-        <w:t xml:space="preserve">|natcan3_190925    |naturalistic |reward_sideR      |0.256   |[0.010, 0.502]   |0.042  |</w:t>
-      </w:r>
-      <w:r>
-        <w:br/>
-      </w:r>
-      <w:r>
-        <w:rPr>
-          <w:rStyle w:val="VerbatimChar"/>
-        </w:rPr>
-        <w:t xml:space="preserve">|natcan3_190925    |naturalistic |sd__(Intercept)   |0.000   |[NA, NA]         |NA     |</w:t>
-      </w:r>
-      <w:r>
-        <w:br/>
-      </w:r>
-      <w:r>
-        <w:rPr>
-          <w:rStyle w:val="VerbatimChar"/>
-        </w:rPr>
-        <w:t xml:space="preserve">|natcan4_180825    |naturalistic |(Intercept)       |-0.114  |[-0.474, 0.245]  |0.533  |</w:t>
-      </w:r>
-      <w:r>
-        <w:br/>
-      </w:r>
-      <w:r>
-        <w:rPr>
-          <w:rStyle w:val="VerbatimChar"/>
-        </w:rPr>
-        <w:t xml:space="preserve">|natcan4_180825    |naturalistic |rank_trial        |-0.005  |[-0.012, 0.001]  |0.122  |</w:t>
-      </w:r>
-      <w:r>
-        <w:br/>
-      </w:r>
-      <w:r>
-        <w:rPr>
-          <w:rStyle w:val="VerbatimChar"/>
-        </w:rPr>
-        <w:t xml:space="preserve">|natcan4_180825    |naturalistic |sideAlt_trialTRUE |-0.207  |[-0.535, 0.121]  |0.216  |</w:t>
-      </w:r>
-      <w:r>
-        <w:br/>
-      </w:r>
-      <w:r>
-        <w:rPr>
-          <w:rStyle w:val="VerbatimChar"/>
-        </w:rPr>
-        <w:t xml:space="preserve">|natcan4_180825    |naturalistic |reward_sideR      |0.608   |[0.283, 0.933]   |&lt;0.001 |</w:t>
-      </w:r>
-      <w:r>
-        <w:br/>
-      </w:r>
-      <w:r>
-        <w:rPr>
-          <w:rStyle w:val="VerbatimChar"/>
-        </w:rPr>
-        <w:t xml:space="preserve">|natcan4_180825    |naturalistic |sd__(Intercept)   |0.076   |[NA, NA]         |NA     |</w:t>
-      </w:r>
-      <w:r>
-        <w:br/>
-      </w:r>
-      <w:r>
-        <w:rPr>
-          <w:rStyle w:val="VerbatimChar"/>
-        </w:rPr>
-        <w:t xml:space="preserve">|natcan5_290825    |naturalistic |(Intercept)       |0.597   |[0.155, 1.038]   |0.008  |</w:t>
-      </w:r>
-      <w:r>
-        <w:br/>
-      </w:r>
-      <w:r>
-        <w:rPr>
-          <w:rStyle w:val="VerbatimChar"/>
-        </w:rPr>
-        <w:t xml:space="preserve">|natcan5_290825    |naturalistic |rank_trial        |0.004   |[-0.005, 0.013]  |0.412  |</w:t>
-      </w:r>
-      <w:r>
-        <w:br/>
-      </w:r>
-      <w:r>
-        <w:rPr>
-          <w:rStyle w:val="VerbatimChar"/>
-        </w:rPr>
-        <w:t xml:space="preserve">|natcan5_290825    |naturalistic |sideAlt_trialTRUE |-0.257  |[-0.632, 0.118]  |0.179  |</w:t>
-      </w:r>
-      <w:r>
-        <w:br/>
-      </w:r>
-      <w:r>
-        <w:rPr>
-          <w:rStyle w:val="VerbatimChar"/>
-        </w:rPr>
-        <w:t xml:space="preserve">|natcan5_290825    |naturalistic |reward_sideR      |-0.792  |[-1.168, -0.415] |&lt;0.001 |</w:t>
-      </w:r>
-      <w:r>
-        <w:br/>
-      </w:r>
-      <w:r>
-        <w:rPr>
-          <w:rStyle w:val="VerbatimChar"/>
-        </w:rPr>
-        <w:t xml:space="preserve">|natcan5_290825    |naturalistic |sd__(Intercept)   |0.000   |[NA, NA]         |NA     |</w:t>
-      </w:r>
-      <w:r>
-        <w:br/>
-      </w:r>
-      <w:r>
-        <w:rPr>
-          <w:rStyle w:val="VerbatimChar"/>
-        </w:rPr>
-        <w:t xml:space="preserve">|natcan6_070925    |naturalistic |(Intercept)       |0.237   |[-0.194, 0.667]  |0.281  |</w:t>
-      </w:r>
-      <w:r>
-        <w:br/>
-      </w:r>
-      <w:r>
-        <w:rPr>
-          <w:rStyle w:val="VerbatimChar"/>
-        </w:rPr>
-        <w:t xml:space="preserve">|natcan6_070925    |naturalistic |rank_trial        |-0.002  |[-0.010, 0.006]  |0.647  |</w:t>
-      </w:r>
-      <w:r>
-        <w:br/>
-      </w:r>
-      <w:r>
-        <w:rPr>
-          <w:rStyle w:val="VerbatimChar"/>
-        </w:rPr>
-        <w:t xml:space="preserve">|natcan6_070925    |naturalistic |sideAlt_trialTRUE |-0.168  |[-0.559, 0.222]  |0.398  |</w:t>
-      </w:r>
-      <w:r>
-        <w:br/>
-      </w:r>
-      <w:r>
-        <w:rPr>
-          <w:rStyle w:val="VerbatimChar"/>
-        </w:rPr>
-        <w:t xml:space="preserve">|natcan6_070925    |naturalistic |reward_sideR      |-0.151  |[-0.536, 0.234]  |0.442  |</w:t>
-      </w:r>
-      <w:r>
-        <w:br/>
-      </w:r>
-      <w:r>
-        <w:rPr>
-          <w:rStyle w:val="VerbatimChar"/>
-        </w:rPr>
-        <w:t xml:space="preserve">|natcan6_070925    |naturalistic |sd__(Intercept)   |0.000   |[NA, NA]         |NA     |</w:t>
+        <w:t xml:space="preserve">|experiment      |nat_or_art   |term                           |logOdds |confint          |pFmt   |</w:t>
+      </w:r>
+      <w:r>
+        <w:br/>
+      </w:r>
+      <w:r>
+        <w:rPr>
+          <w:rStyle w:val="VerbatimChar"/>
+        </w:rPr>
+        <w:t xml:space="preserve">|:---------------|:------------|:------------------------------|:-------|:----------------|:------|</w:t>
+      </w:r>
+      <w:r>
+        <w:br/>
+      </w:r>
+      <w:r>
+        <w:rPr>
+          <w:rStyle w:val="VerbatimChar"/>
+        </w:rPr>
+        <w:t xml:space="preserve">|perpPara_170725 |artificial   |(Intercept)                    |0.821   |[0.183, 1.458]   |0.012  |</w:t>
+      </w:r>
+      <w:r>
+        <w:br/>
+      </w:r>
+      <w:r>
+        <w:rPr>
+          <w:rStyle w:val="VerbatimChar"/>
+        </w:rPr>
+        <w:t xml:space="preserve">|perpPara_170725 |artificial   |rank_trial                     |0.038   |[0.016, 0.061]   |&lt;0.001 |</w:t>
+      </w:r>
+      <w:r>
+        <w:br/>
+      </w:r>
+      <w:r>
+        <w:rPr>
+          <w:rStyle w:val="VerbatimChar"/>
+        </w:rPr>
+        <w:t xml:space="preserve">|perpPara_170725 |artificial   |manipulationcontrol            |-0.123  |[-1.157, 0.912]  |0.816  |</w:t>
+      </w:r>
+      <w:r>
+        <w:br/>
+      </w:r>
+      <w:r>
+        <w:rPr>
+          <w:rStyle w:val="VerbatimChar"/>
+        </w:rPr>
+        <w:t xml:space="preserve">|perpPara_170725 |artificial   |sideAlt_trialTRUE              |0.093   |[-0.384, 0.570]  |0.702  |</w:t>
+      </w:r>
+      <w:r>
+        <w:br/>
+      </w:r>
+      <w:r>
+        <w:rPr>
+          <w:rStyle w:val="VerbatimChar"/>
+        </w:rPr>
+        <w:t xml:space="preserve">|perpPara_170725 |artificial   |reward_sideR                   |-0.835  |[-1.306, -0.363] |&lt;0.001 |</w:t>
+      </w:r>
+      <w:r>
+        <w:br/>
+      </w:r>
+      <w:r>
+        <w:rPr>
+          <w:rStyle w:val="VerbatimChar"/>
+        </w:rPr>
+        <w:t xml:space="preserve">|perpPara_170725 |artificial   |rank_trial:manipulationcontrol |-0.074  |[-0.160, 0.011]  |0.089  |</w:t>
+      </w:r>
+      <w:r>
+        <w:br/>
+      </w:r>
+      <w:r>
+        <w:rPr>
+          <w:rStyle w:val="VerbatimChar"/>
+        </w:rPr>
+        <w:t xml:space="preserve">|perpPara_170725 |artificial   |sd__(Intercept)                |0.349   |[NA, NA]         |NA     |</w:t>
+      </w:r>
+      <w:r>
+        <w:br/>
+      </w:r>
+      <w:r>
+        <w:rPr>
+          <w:rStyle w:val="VerbatimChar"/>
+        </w:rPr>
+        <w:t xml:space="preserve">|thinOb_150823   |artificial   |(Intercept)                    |-1.091  |[-1.650, -0.532] |&lt;0.001 |</w:t>
+      </w:r>
+      <w:r>
+        <w:br/>
+      </w:r>
+      <w:r>
+        <w:rPr>
+          <w:rStyle w:val="VerbatimChar"/>
+        </w:rPr>
+        <w:t xml:space="preserve">|thinOb_150823   |artificial   |rank_trial                     |0.028   |[0.014, 0.042]   |&lt;0.001 |</w:t>
+      </w:r>
+      <w:r>
+        <w:br/>
+      </w:r>
+      <w:r>
+        <w:rPr>
+          <w:rStyle w:val="VerbatimChar"/>
+        </w:rPr>
+        <w:t xml:space="preserve">|thinOb_150823   |artificial   |manipulationcontrol            |-0.112  |[-1.153, 0.930]  |0.834  |</w:t>
+      </w:r>
+      <w:r>
+        <w:br/>
+      </w:r>
+      <w:r>
+        <w:rPr>
+          <w:rStyle w:val="VerbatimChar"/>
+        </w:rPr>
+        <w:t xml:space="preserve">|thinOb_150823   |artificial   |sideAlt_trialTRUE              |0.100   |[-0.331, 0.531]  |0.650  |</w:t>
+      </w:r>
+      <w:r>
+        <w:br/>
+      </w:r>
+      <w:r>
+        <w:rPr>
+          <w:rStyle w:val="VerbatimChar"/>
+        </w:rPr>
+        <w:t xml:space="preserve">|thinOb_150823   |artificial   |reward_sideR                   |2.193   |[1.738, 2.649]   |&lt;0.001 |</w:t>
+      </w:r>
+      <w:r>
+        <w:br/>
+      </w:r>
+      <w:r>
+        <w:rPr>
+          <w:rStyle w:val="VerbatimChar"/>
+        </w:rPr>
+        <w:t xml:space="preserve">|thinOb_150823   |artificial   |rank_trial:manipulationcontrol |-0.005  |[-0.115, 0.104]  |0.927  |</w:t>
+      </w:r>
+      <w:r>
+        <w:br/>
+      </w:r>
+      <w:r>
+        <w:rPr>
+          <w:rStyle w:val="VerbatimChar"/>
+        </w:rPr>
+        <w:t xml:space="preserve">|thinOb_150823   |artificial   |sd__(Intercept)                |0.000   |[NA, NA]         |NA     |</w:t>
+      </w:r>
+      <w:r>
+        <w:br/>
+      </w:r>
+      <w:r>
+        <w:rPr>
+          <w:rStyle w:val="VerbatimChar"/>
+        </w:rPr>
+        <w:t xml:space="preserve">|natcan1_170923  |naturalistic |(Intercept)                    |-0.151  |[-0.570, 0.268]  |0.480  |</w:t>
+      </w:r>
+      <w:r>
+        <w:br/>
+      </w:r>
+      <w:r>
+        <w:rPr>
+          <w:rStyle w:val="VerbatimChar"/>
+        </w:rPr>
+        <w:t xml:space="preserve">|natcan1_170923  |naturalistic |rank_trial                     |0.004   |[-0.002, 0.010]  |0.168  |</w:t>
+      </w:r>
+      <w:r>
+        <w:br/>
+      </w:r>
+      <w:r>
+        <w:rPr>
+          <w:rStyle w:val="VerbatimChar"/>
+        </w:rPr>
+        <w:t xml:space="preserve">|natcan1_170923  |naturalistic |manipulationcontrol            |-0.241  |[-1.650, 1.168]  |0.738  |</w:t>
+      </w:r>
+      <w:r>
+        <w:br/>
+      </w:r>
+      <w:r>
+        <w:rPr>
+          <w:rStyle w:val="VerbatimChar"/>
+        </w:rPr>
+        <w:t xml:space="preserve">|natcan1_170923  |naturalistic |sideAlt_trialTRUE              |0.149   |[-0.206, 0.504]  |0.410  |</w:t>
+      </w:r>
+      <w:r>
+        <w:br/>
+      </w:r>
+      <w:r>
+        <w:rPr>
+          <w:rStyle w:val="VerbatimChar"/>
+        </w:rPr>
+        <w:t xml:space="preserve">|natcan1_170923  |naturalistic |reward_sideR                   |0.991   |[0.635, 1.346]   |&lt;0.001 |</w:t>
+      </w:r>
+      <w:r>
+        <w:br/>
+      </w:r>
+      <w:r>
+        <w:rPr>
+          <w:rStyle w:val="VerbatimChar"/>
+        </w:rPr>
+        <w:t xml:space="preserve">|natcan1_170923  |naturalistic |rank_trial:manipulationcontrol |-0.029  |[-0.246, 0.188]  |0.794  |</w:t>
+      </w:r>
+      <w:r>
+        <w:br/>
+      </w:r>
+      <w:r>
+        <w:rPr>
+          <w:rStyle w:val="VerbatimChar"/>
+        </w:rPr>
+        <w:t xml:space="preserve">|natcan1_170923  |naturalistic |sd__(Intercept)                |0.112   |[NA, NA]         |NA     |</w:t>
+      </w:r>
+      <w:r>
+        <w:br/>
+      </w:r>
+      <w:r>
+        <w:rPr>
+          <w:rStyle w:val="VerbatimChar"/>
+        </w:rPr>
+        <w:t xml:space="preserve">|natcan3_080825  |naturalistic |(Intercept)                    |0.383   |[-0.018, 0.784]  |0.061  |</w:t>
+      </w:r>
+      <w:r>
+        <w:br/>
+      </w:r>
+      <w:r>
+        <w:rPr>
+          <w:rStyle w:val="VerbatimChar"/>
+        </w:rPr>
+        <w:t xml:space="preserve">|natcan3_080825  |naturalistic |rank_trial                     |0.007   |[-0.003, 0.018]  |0.182  |</w:t>
+      </w:r>
+      <w:r>
+        <w:br/>
+      </w:r>
+      <w:r>
+        <w:rPr>
+          <w:rStyle w:val="VerbatimChar"/>
+        </w:rPr>
+        <w:t xml:space="preserve">|natcan3_080825  |naturalistic |manipulationcontrol            |0.200   |[-0.615, 1.014]  |0.631  |</w:t>
+      </w:r>
+      <w:r>
+        <w:br/>
+      </w:r>
+      <w:r>
+        <w:rPr>
+          <w:rStyle w:val="VerbatimChar"/>
+        </w:rPr>
+        <w:t xml:space="preserve">|natcan3_080825  |naturalistic |sideAlt_trialTRUE              |-0.210  |[-0.539, 0.119]  |0.211  |</w:t>
+      </w:r>
+      <w:r>
+        <w:br/>
+      </w:r>
+      <w:r>
+        <w:rPr>
+          <w:rStyle w:val="VerbatimChar"/>
+        </w:rPr>
+        <w:t xml:space="preserve">|natcan3_080825  |naturalistic |reward_sideR                   |-0.621  |[-0.946, -0.296] |&lt;0.001 |</w:t>
+      </w:r>
+      <w:r>
+        <w:br/>
+      </w:r>
+      <w:r>
+        <w:rPr>
+          <w:rStyle w:val="VerbatimChar"/>
+        </w:rPr>
+        <w:t xml:space="preserve">|natcan3_080825  |naturalistic |rank_trial:manipulationcontrol |-0.015  |[-0.085, 0.054]  |0.664  |</w:t>
+      </w:r>
+      <w:r>
+        <w:br/>
+      </w:r>
+      <w:r>
+        <w:rPr>
+          <w:rStyle w:val="VerbatimChar"/>
+        </w:rPr>
+        <w:t xml:space="preserve">|natcan3_080825  |naturalistic |sd__(Intercept)                |0.026   |[NA, NA]         |NA     |</w:t>
+      </w:r>
+      <w:r>
+        <w:br/>
+      </w:r>
+      <w:r>
+        <w:rPr>
+          <w:rStyle w:val="VerbatimChar"/>
+        </w:rPr>
+        <w:t xml:space="preserve">|natcan3_190925  |naturalistic |(Intercept)                    |-0.085  |[-0.379, 0.209]  |0.572  |</w:t>
+      </w:r>
+      <w:r>
+        <w:br/>
+      </w:r>
+      <w:r>
+        <w:rPr>
+          <w:rStyle w:val="VerbatimChar"/>
+        </w:rPr>
+        <w:t xml:space="preserve">|natcan3_190925  |naturalistic |rank_trial                     |0.005   |[0.001, 0.009]   |0.016  |</w:t>
+      </w:r>
+      <w:r>
+        <w:br/>
+      </w:r>
+      <w:r>
+        <w:rPr>
+          <w:rStyle w:val="VerbatimChar"/>
+        </w:rPr>
+        <w:t xml:space="preserve">|natcan3_190925  |naturalistic |manipulationcontrol            |-0.500  |[-1.425, 0.425]  |0.289  |</w:t>
+      </w:r>
+      <w:r>
+        <w:br/>
+      </w:r>
+      <w:r>
+        <w:rPr>
+          <w:rStyle w:val="VerbatimChar"/>
+        </w:rPr>
+        <w:t xml:space="preserve">|natcan3_190925  |naturalistic |sideAlt_trialTRUE              |0.047   |[-0.197, 0.291]  |0.705  |</w:t>
+      </w:r>
+      <w:r>
+        <w:br/>
+      </w:r>
+      <w:r>
+        <w:rPr>
+          <w:rStyle w:val="VerbatimChar"/>
+        </w:rPr>
+        <w:t xml:space="preserve">|natcan3_190925  |naturalistic |reward_sideR                   |0.274   |[0.036, 0.511]   |0.024  |</w:t>
+      </w:r>
+      <w:r>
+        <w:br/>
+      </w:r>
+      <w:r>
+        <w:rPr>
+          <w:rStyle w:val="VerbatimChar"/>
+        </w:rPr>
+        <w:t xml:space="preserve">|natcan3_190925  |naturalistic |rank_trial:manipulationcontrol |0.040   |[-0.016, 0.097]  |0.157  |</w:t>
+      </w:r>
+      <w:r>
+        <w:br/>
+      </w:r>
+      <w:r>
+        <w:rPr>
+          <w:rStyle w:val="VerbatimChar"/>
+        </w:rPr>
+        <w:t xml:space="preserve">|natcan3_190925  |naturalistic |sd__(Intercept)                |0.000   |[NA, NA]         |NA     |</w:t>
+      </w:r>
+      <w:r>
+        <w:br/>
+      </w:r>
+      <w:r>
+        <w:rPr>
+          <w:rStyle w:val="VerbatimChar"/>
+        </w:rPr>
+        <w:t xml:space="preserve">|natcan4_180825  |naturalistic |(Intercept)                    |-0.065  |[-0.419, 0.288]  |0.717  |</w:t>
+      </w:r>
+      <w:r>
+        <w:br/>
+      </w:r>
+      <w:r>
+        <w:rPr>
+          <w:rStyle w:val="VerbatimChar"/>
+        </w:rPr>
+        <w:t xml:space="preserve">|natcan4_180825  |naturalistic |rank_trial                     |-0.005  |[-0.012, 0.001]  |0.120  |</w:t>
+      </w:r>
+      <w:r>
+        <w:br/>
+      </w:r>
+      <w:r>
+        <w:rPr>
+          <w:rStyle w:val="VerbatimChar"/>
+        </w:rPr>
+        <w:t xml:space="preserve">|natcan4_180825  |naturalistic |manipulationcontrol            |-0.048  |[-1.014, 0.918]  |0.923  |</w:t>
+      </w:r>
+      <w:r>
+        <w:br/>
+      </w:r>
+      <w:r>
+        <w:rPr>
+          <w:rStyle w:val="VerbatimChar"/>
+        </w:rPr>
+        <w:t xml:space="preserve">|natcan4_180825  |naturalistic |sideAlt_trialTRUE              |-0.184  |[-0.493, 0.125]  |0.243  |</w:t>
+      </w:r>
+      <w:r>
+        <w:br/>
+      </w:r>
+      <w:r>
+        <w:rPr>
+          <w:rStyle w:val="VerbatimChar"/>
+        </w:rPr>
+        <w:t xml:space="preserve">|natcan4_180825  |naturalistic |reward_sideR                   |0.487   |[0.181, 0.793]   |0.002  |</w:t>
+      </w:r>
+      <w:r>
+        <w:br/>
+      </w:r>
+      <w:r>
+        <w:rPr>
+          <w:rStyle w:val="VerbatimChar"/>
+        </w:rPr>
+        <w:t xml:space="preserve">|natcan4_180825  |naturalistic |rank_trial:manipulationcontrol |-0.033  |[-0.119, 0.053]  |0.454  |</w:t>
+      </w:r>
+      <w:r>
+        <w:br/>
+      </w:r>
+      <w:r>
+        <w:rPr>
+          <w:rStyle w:val="VerbatimChar"/>
+        </w:rPr>
+        <w:t xml:space="preserve">|natcan4_180825  |naturalistic |sd__(Intercept)                |0.084   |[NA, NA]         |NA     |</w:t>
       </w:r>
     </w:p>
     <w:bookmarkEnd w:id="38"/>

</xml_diff>